<commit_message>
Fix cover page order: cover now precedes the TOC, not the reverse
pandoc's --toc flag inserts the native TOC field at the very top of
the document body, ahead of the title-block paragraphs, so the PDF
rendered TOC -> Cover -> Part 0 instead of Cover -> TOC -> Part 0.
style_master_guide.py now relocates the TOC field's SDT node to
directly after the title block, with explicit page breaks pinning
the cover to its own page and the TOC to its own page range.
</commit_message>
<xml_diff>
--- a/deliverables/journi_Master_User_Guide.docx
+++ b/deliverables/journi_Master_User_Guide.docx
@@ -2,6 +2,93 @@
 <file path=word/document.xml><?xml version="1.0" encoding="utf-8"?>
 <w:document xmlns:w="http://schemas.openxmlformats.org/wordprocessingml/2006/main" xmlns:m="http://schemas.openxmlformats.org/officeDocument/2006/math" xmlns:r="http://schemas.openxmlformats.org/officeDocument/2006/relationships" xmlns:o="urn:schemas-microsoft-com:office:office" xmlns:v="urn:schemas-microsoft-com:vml" xmlns:w10="urn:schemas-microsoft-com:office:word" xmlns:a="http://schemas.openxmlformats.org/drawingml/2006/main" xmlns:pic="http://schemas.openxmlformats.org/drawingml/2006/picture" xmlns:wp="http://schemas.openxmlformats.org/drawingml/2006/wordprocessingDrawing">
   <w:body>
+    <w:p>
+      <w:pPr>
+        <w:pStyle w:val="FirstParagraph"/>
+        <w:jc w:val="center"/>
+      </w:pPr>
+      <w:r>
+        <w:rPr>
+          <w:bCs/>
+          <w:b/>
+          <w:i w:val="0"/>
+          <w:color w:val="1F4B45"/>
+          <w:sz w:val="60"/>
+        </w:rPr>
+        <w:t xml:space="preserve">journi</w:t>
+      </w:r>
+    </w:p>
+    <w:p>
+      <w:pPr>
+        <w:pStyle w:val="BodyText"/>
+        <w:jc w:val="center"/>
+      </w:pPr>
+      <w:r>
+        <w:rPr>
+          <w:bCs/>
+          <w:b w:val="0"/>
+          <w:i w:val="0"/>
+          <w:color w:val="333333"/>
+          <w:sz w:val="30"/>
+        </w:rPr>
+        <w:t xml:space="preserve">The Complete User Guide</w:t>
+      </w:r>
+    </w:p>
+    <w:p>
+      <w:pPr>
+        <w:pStyle w:val="BodyText"/>
+        <w:jc w:val="center"/>
+      </w:pPr>
+      <w:r>
+        <w:rPr>
+          <w:iCs/>
+          <w:b w:val="0"/>
+          <w:i/>
+          <w:color w:val="333333"/>
+          <w:sz w:val="23"/>
+        </w:rPr>
+        <w:t xml:space="preserve">Tenant Setup · All 20 Modules · All 16 End-to-End Processes · A Change Management Scenario Library</w:t>
+      </w:r>
+    </w:p>
+    <w:p>
+      <w:pPr>
+        <w:pStyle w:val="BodyText"/>
+        <w:jc w:val="center"/>
+      </w:pPr>
+      <w:r>
+        <w:rPr>
+          <w:iCs/>
+          <w:b w:val="0"/>
+          <w:i/>
+          <w:color w:val="333333"/>
+          <w:sz w:val="23"/>
+        </w:rPr>
+        <w:t xml:space="preserve">A Single Running Organization, Followed From Tenant Creation to Sustainment</w:t>
+      </w:r>
+    </w:p>
+    <w:p>
+      <w:pPr>
+        <w:pStyle w:val="BodyText"/>
+        <w:jc w:val="center"/>
+      </w:pPr>
+      <w:r>
+        <w:rPr>
+          <w:b w:val="0"/>
+          <w:i w:val="0"/>
+          <w:color w:val="333333"/>
+          <w:sz w:val="22"/>
+        </w:rPr>
+        <w:t xml:space="preserve">Version 1.0 · August 2026 · Confidential</w:t>
+      </w:r>
+    </w:p>
+    <w:p>
+      <w:r>
+        <w:rPr>
+          <w:sz w:val="25"/>
+        </w:rPr>
+        <w:br w:type="page"/>
+      </w:r>
+    </w:p>
     <w:sdt>
       <w:sdtPr>
         <w:docPartObj>
@@ -29,82 +116,11 @@
       </w:sdtContent>
     </w:sdt>
     <w:p>
-      <w:pPr>
-        <w:pStyle w:val="FirstParagraph"/>
-        <w:jc w:val="center"/>
-      </w:pPr>
-      <w:r>
-        <w:rPr>
-          <w:bCs/>
-          <w:b/>
-          <w:i w:val="0"/>
-          <w:color w:val="1F4B45"/>
-          <w:sz w:val="60"/>
-        </w:rPr>
-        <w:t xml:space="preserve">journi</w:t>
-      </w:r>
-    </w:p>
-    <w:p>
-      <w:pPr>
-        <w:pStyle w:val="BodyText"/>
-        <w:jc w:val="center"/>
-      </w:pPr>
-      <w:r>
-        <w:rPr>
-          <w:bCs/>
-          <w:b w:val="0"/>
-          <w:i w:val="0"/>
-          <w:color w:val="333333"/>
-          <w:sz w:val="30"/>
-        </w:rPr>
-        <w:t xml:space="preserve">The Complete User Guide</w:t>
-      </w:r>
-    </w:p>
-    <w:p>
-      <w:pPr>
-        <w:pStyle w:val="BodyText"/>
-        <w:jc w:val="center"/>
-      </w:pPr>
-      <w:r>
-        <w:rPr>
-          <w:iCs/>
-          <w:b w:val="0"/>
-          <w:i/>
-          <w:color w:val="333333"/>
-          <w:sz w:val="23"/>
-        </w:rPr>
-        <w:t xml:space="preserve">Tenant Setup · All 20 Modules · All 16 End-to-End Processes · A Change Management Scenario Library</w:t>
-      </w:r>
-    </w:p>
-    <w:p>
-      <w:pPr>
-        <w:pStyle w:val="BodyText"/>
-        <w:jc w:val="center"/>
-      </w:pPr>
-      <w:r>
-        <w:rPr>
-          <w:iCs/>
-          <w:b w:val="0"/>
-          <w:i/>
-          <w:color w:val="333333"/>
-          <w:sz w:val="23"/>
-        </w:rPr>
-        <w:t xml:space="preserve">A Single Running Organization, Followed From Tenant Creation to Sustainment</w:t>
-      </w:r>
-    </w:p>
-    <w:p>
-      <w:pPr>
-        <w:pStyle w:val="BodyText"/>
-        <w:jc w:val="center"/>
-      </w:pPr>
-      <w:r>
-        <w:rPr>
-          <w:b w:val="0"/>
-          <w:i w:val="0"/>
-          <w:color w:val="333333"/>
-          <w:sz w:val="22"/>
-        </w:rPr>
-        <w:t xml:space="preserve">Version 1.0 · August 2026 · Confidential</w:t>
+      <w:r>
+        <w:rPr>
+          <w:sz w:val="25"/>
+        </w:rPr>
+        <w:br w:type="page"/>
       </w:r>
     </w:p>
     <w:p>

</xml_diff>

<commit_message>
Document Module 21 (Field Notes) in the guide; convert capturable gaps
Added M21 to Part 2's module tour and the Appendix A.4 Module Index,
bumped the module count from 20 to 21 throughout. Converted the 16
Part 1B week-by-week rows that represented genuinely capturable
knowledge (a workshop happened, a decision was made outside journi,
a sign-off landed, a nominee list was drafted) from 'No journi entry
yet' to a real M21 (Field Notes) entry with simulated data. Left
alone the rows that are legitimately empty, already logged elsewhere
(e.g. the Week 22 sponsor action on M7), or deliberately unlogged for
privacy (the Week 35 1:1 conversation).
</commit_message>
<xml_diff>
--- a/deliverables/journi_Master_User_Guide.docx
+++ b/deliverables/journi_Master_User_Guide.docx
@@ -47,7 +47,7 @@
           <w:color w:val="333333"/>
           <w:sz w:val="23"/>
         </w:rPr>
-        <w:t xml:space="preserve">Tenant Setup · All 20 Modules · All 16 End-to-End Processes · A Change Management Scenario Library</w:t>
+        <w:t xml:space="preserve">Tenant Setup · All 21 Modules · All 16 End-to-End Processes · A Change Management Scenario Library</w:t>
       </w:r>
     </w:p>
     <w:p>
@@ -174,7 +174,7 @@
         <w:rPr>
           <w:sz w:val="25"/>
         </w:rPr>
-        <w:t xml:space="preserve">This is journi’s single comprehensive reference: one guide that starts at a genuinely empty tenant, walks through every one of journi’s 20 modules, exercises all 16 processes in the End-to-End Process Catalogue, and hosts a library of distinct Change Management scenarios so a reader can see how journi behaves across more than one kind of change — not only a large technology rollout.</w:t>
+        <w:t xml:space="preserve">This is journi’s single comprehensive reference: one guide that starts at a genuinely empty tenant, walks through every one of journi’s 21 modules, exercises all 16 processes in the End-to-End Process Catalogue, and hosts a library of distinct Change Management scenarios so a reader can see how journi behaves across more than one kind of change — not only a large technology rollout.</w:t>
       </w:r>
     </w:p>
     <w:p>
@@ -292,7 +292,7 @@
         <w:rPr>
           <w:sz w:val="25"/>
         </w:rPr>
-        <w:t xml:space="preserve">All 20 modules, each demonstrated against Bouregreg Group’s real, growing data set, with CRUD and RBAC behavior called out per role.</w:t>
+        <w:t xml:space="preserve">All 21 modules, each demonstrated against Bouregreg Group’s real, growing data set, with CRUD and RBAC behavior called out per role.</w:t>
       </w:r>
     </w:p>
     <w:p>
@@ -4528,7 +4528,7 @@
         <w:rPr>
           <w:sz w:val="25"/>
         </w:rPr>
-        <w:t xml:space="preserve">With this checklist complete, Bouregreg Group is a fully operational journi tenant with one live Change Management Project. Part 1B walks that project week by week through all four frameworks, normal flow and exceptions; Part 2 then tours all 20 modules against this same, now-real data set.</w:t>
+        <w:t xml:space="preserve">With this checklist complete, Bouregreg Group is a fully operational journi tenant with one live Change Management Project. Part 1B walks that project week by week through all four frameworks, normal flow and exceptions; Part 2 then tours all 21 modules against this same, now-real data set.</w:t>
       </w:r>
     </w:p>
     <w:p>
@@ -12713,7 +12713,79 @@
               <w:rPr>
                 <w:sz w:val="22"/>
               </w:rPr>
-              <w:t xml:space="preserve">No journi entry yet — workshop output captured on paper/whiteboard first, transcribed in Week 4.</w:t>
+              <w:t xml:space="preserve">M21 (Field Notes) — type in: Category: Workshop · Title:</w:t>
+            </w:r>
+            <w:r>
+              <w:rPr>
+                <w:sz w:val="22"/>
+              </w:rPr>
+              <w:t xml:space="preserve"> </w:t>
+            </w:r>
+            <w:r>
+              <w:rPr>
+                <w:sz w:val="22"/>
+              </w:rPr>
+              <w:t xml:space="preserve">“</w:t>
+            </w:r>
+            <w:r>
+              <w:rPr>
+                <w:sz w:val="22"/>
+              </w:rPr>
+              <w:t xml:space="preserve">Discovery Workshop 1 — Casablanca HQ</w:t>
+            </w:r>
+            <w:r>
+              <w:rPr>
+                <w:sz w:val="22"/>
+              </w:rPr>
+              <w:t xml:space="preserve">”</w:t>
+            </w:r>
+            <w:r>
+              <w:rPr>
+                <w:sz w:val="22"/>
+              </w:rPr>
+              <w:t xml:space="preserve"> </w:t>
+            </w:r>
+            <w:r>
+              <w:rPr>
+                <w:sz w:val="22"/>
+              </w:rPr>
+              <w:t xml:space="preserve">· Logged by: Meryem Sabri · Body:</w:t>
+            </w:r>
+            <w:r>
+              <w:rPr>
+                <w:sz w:val="22"/>
+              </w:rPr>
+              <w:t xml:space="preserve"> </w:t>
+            </w:r>
+            <w:r>
+              <w:rPr>
+                <w:sz w:val="22"/>
+              </w:rPr>
+              <w:t xml:space="preserve">“</w:t>
+            </w:r>
+            <w:r>
+              <w:rPr>
+                <w:sz w:val="22"/>
+              </w:rPr>
+              <w:t xml:space="preserve">Order Management and Finance current-state process maps captured on whiteboard; three workaround patterns already visible (manual re-keying, whiteboard tracking). Full transcription into the Workaround Inventory targeted for Week 4.</w:t>
+            </w:r>
+            <w:r>
+              <w:rPr>
+                <w:sz w:val="22"/>
+              </w:rPr>
+              <w:t xml:space="preserve">”</w:t>
+            </w:r>
+            <w:r>
+              <w:rPr>
+                <w:sz w:val="22"/>
+              </w:rPr>
+              <w:t xml:space="preserve"> </w:t>
+            </w:r>
+            <w:r>
+              <w:rPr>
+                <w:sz w:val="22"/>
+              </w:rPr>
+              <w:t xml:space="preserve">· Related module: none yet — becomes an M4 (Stakeholder Mapping) input once the business case is quantified.</w:t>
             </w:r>
           </w:p>
         </w:tc>
@@ -12830,7 +12902,79 @@
               <w:rPr>
                 <w:sz w:val="22"/>
               </w:rPr>
-              <w:t xml:space="preserve">No journi entry yet.</w:t>
+              <w:t xml:space="preserve">M21 (Field Notes) — type in: Category: Workshop · Title:</w:t>
+            </w:r>
+            <w:r>
+              <w:rPr>
+                <w:sz w:val="22"/>
+              </w:rPr>
+              <w:t xml:space="preserve"> </w:t>
+            </w:r>
+            <w:r>
+              <w:rPr>
+                <w:sz w:val="22"/>
+              </w:rPr>
+              <w:t xml:space="preserve">“</w:t>
+            </w:r>
+            <w:r>
+              <w:rPr>
+                <w:sz w:val="22"/>
+              </w:rPr>
+              <w:t xml:space="preserve">Discovery Workshop 2 — Kenitra Plant</w:t>
+            </w:r>
+            <w:r>
+              <w:rPr>
+                <w:sz w:val="22"/>
+              </w:rPr>
+              <w:t xml:space="preserve">”</w:t>
+            </w:r>
+            <w:r>
+              <w:rPr>
+                <w:sz w:val="22"/>
+              </w:rPr>
+              <w:t xml:space="preserve"> </w:t>
+            </w:r>
+            <w:r>
+              <w:rPr>
+                <w:sz w:val="22"/>
+              </w:rPr>
+              <w:t xml:space="preserve">· Logged by: Meryem Sabri · Body:</w:t>
+            </w:r>
+            <w:r>
+              <w:rPr>
+                <w:sz w:val="22"/>
+              </w:rPr>
+              <w:t xml:space="preserve"> </w:t>
+            </w:r>
+            <w:r>
+              <w:rPr>
+                <w:sz w:val="22"/>
+              </w:rPr>
+              <w:t xml:space="preserve">“</w:t>
+            </w:r>
+            <w:r>
+              <w:rPr>
+                <w:sz w:val="22"/>
+              </w:rPr>
+              <w:t xml:space="preserve">Inventory and Plant Operations workshop complete. Noted early attachment to the current manual process among plant-floor staff — worth watching once Build reaches the Inventory module (Sprint 2).</w:t>
+            </w:r>
+            <w:r>
+              <w:rPr>
+                <w:sz w:val="22"/>
+              </w:rPr>
+              <w:t xml:space="preserve">”</w:t>
+            </w:r>
+            <w:r>
+              <w:rPr>
+                <w:sz w:val="22"/>
+              </w:rPr>
+              <w:t xml:space="preserve"> </w:t>
+            </w:r>
+            <w:r>
+              <w:rPr>
+                <w:sz w:val="22"/>
+              </w:rPr>
+              <w:t xml:space="preserve">· Related module: none yet.</w:t>
             </w:r>
           </w:p>
         </w:tc>
@@ -13031,7 +13175,79 @@
               <w:rPr>
                 <w:sz w:val="22"/>
               </w:rPr>
-              <w:t xml:space="preserve">No journi entry yet — findings staged for the business case in Week 5.</w:t>
+              <w:t xml:space="preserve">M21 (Field Notes) — type in: Category: Workshop · Title:</w:t>
+            </w:r>
+            <w:r>
+              <w:rPr>
+                <w:sz w:val="22"/>
+              </w:rPr>
+              <w:t xml:space="preserve"> </w:t>
+            </w:r>
+            <w:r>
+              <w:rPr>
+                <w:sz w:val="22"/>
+              </w:rPr>
+              <w:t xml:space="preserve">“</w:t>
+            </w:r>
+            <w:r>
+              <w:rPr>
+                <w:sz w:val="22"/>
+              </w:rPr>
+              <w:t xml:space="preserve">Discovery Workshops Complete — Workaround Inventory Compiled</w:t>
+            </w:r>
+            <w:r>
+              <w:rPr>
+                <w:sz w:val="22"/>
+              </w:rPr>
+              <w:t xml:space="preserve">”</w:t>
+            </w:r>
+            <w:r>
+              <w:rPr>
+                <w:sz w:val="22"/>
+              </w:rPr>
+              <w:t xml:space="preserve"> </w:t>
+            </w:r>
+            <w:r>
+              <w:rPr>
+                <w:sz w:val="22"/>
+              </w:rPr>
+              <w:t xml:space="preserve">· Logged by: Meryem Sabri · Body:</w:t>
+            </w:r>
+            <w:r>
+              <w:rPr>
+                <w:sz w:val="22"/>
+              </w:rPr>
+              <w:t xml:space="preserve"> </w:t>
+            </w:r>
+            <w:r>
+              <w:rPr>
+                <w:sz w:val="22"/>
+              </w:rPr>
+              <w:t xml:space="preserve">“</w:t>
+            </w:r>
+            <w:r>
+              <w:rPr>
+                <w:sz w:val="22"/>
+              </w:rPr>
+              <w:t xml:space="preserve">All three site workshops complete; full workaround inventory compiled (see CM Track this week). Staged as the evidentiary basis for the Week 5–6 business case.</w:t>
+            </w:r>
+            <w:r>
+              <w:rPr>
+                <w:sz w:val="22"/>
+              </w:rPr>
+              <w:t xml:space="preserve">”</w:t>
+            </w:r>
+            <w:r>
+              <w:rPr>
+                <w:sz w:val="22"/>
+              </w:rPr>
+              <w:t xml:space="preserve"> </w:t>
+            </w:r>
+            <w:r>
+              <w:rPr>
+                <w:sz w:val="22"/>
+              </w:rPr>
+              <w:t xml:space="preserve">· Related module: M1 (Hierarchy).</w:t>
             </w:r>
           </w:p>
         </w:tc>
@@ -13148,7 +13364,79 @@
               <w:rPr>
                 <w:sz w:val="22"/>
               </w:rPr>
-              <w:t xml:space="preserve">No direct journi entry — feeds the Main Project business case record (M1 (Hierarchy)) in Week 6.</w:t>
+              <w:t xml:space="preserve">M21 (Field Notes) — type in: Category: Other · Title:</w:t>
+            </w:r>
+            <w:r>
+              <w:rPr>
+                <w:sz w:val="22"/>
+              </w:rPr>
+              <w:t xml:space="preserve"> </w:t>
+            </w:r>
+            <w:r>
+              <w:rPr>
+                <w:sz w:val="22"/>
+              </w:rPr>
+              <w:t xml:space="preserve">“</w:t>
+            </w:r>
+            <w:r>
+              <w:rPr>
+                <w:sz w:val="22"/>
+              </w:rPr>
+              <w:t xml:space="preserve">Reconciliation Time-Log Pull, All Sites</w:t>
+            </w:r>
+            <w:r>
+              <w:rPr>
+                <w:sz w:val="22"/>
+              </w:rPr>
+              <w:t xml:space="preserve">”</w:t>
+            </w:r>
+            <w:r>
+              <w:rPr>
+                <w:sz w:val="22"/>
+              </w:rPr>
+              <w:t xml:space="preserve"> </w:t>
+            </w:r>
+            <w:r>
+              <w:rPr>
+                <w:sz w:val="22"/>
+              </w:rPr>
+              <w:t xml:space="preserve">· Logged by: Driss El Amrani · Body:</w:t>
+            </w:r>
+            <w:r>
+              <w:rPr>
+                <w:sz w:val="22"/>
+              </w:rPr>
+              <w:t xml:space="preserve"> </w:t>
+            </w:r>
+            <w:r>
+              <w:rPr>
+                <w:sz w:val="22"/>
+              </w:rPr>
+              <w:t xml:space="preserve">“</w:t>
+            </w:r>
+            <w:r>
+              <w:rPr>
+                <w:sz w:val="22"/>
+              </w:rPr>
+              <w:t xml:space="preserve">Casablanca 62 hrs/month; Kenitra 21 hrs/month; Settat 19 hrs/month — each figure traced to a named Week 4 workaround, not a general estimate. Feeds the Main Project business case on M1 (Hierarchy), Week 6.</w:t>
+            </w:r>
+            <w:r>
+              <w:rPr>
+                <w:sz w:val="22"/>
+              </w:rPr>
+              <w:t xml:space="preserve">”</w:t>
+            </w:r>
+            <w:r>
+              <w:rPr>
+                <w:sz w:val="22"/>
+              </w:rPr>
+              <w:t xml:space="preserve"> </w:t>
+            </w:r>
+            <w:r>
+              <w:rPr>
+                <w:sz w:val="22"/>
+              </w:rPr>
+              <w:t xml:space="preserve">· Related module: M1 (Hierarchy).</w:t>
             </w:r>
           </w:p>
         </w:tc>
@@ -14072,7 +14360,79 @@
               <w:rPr>
                 <w:sz w:val="22"/>
               </w:rPr>
-              <w:t xml:space="preserve">No journi entry yet — design principles are drafted outside journi and referenced by name in later M17 (WBS &amp; Gantt) task notes.</w:t>
+              <w:t xml:space="preserve">M21 (Field Notes) — type in: Category: Workshop · Title:</w:t>
+            </w:r>
+            <w:r>
+              <w:rPr>
+                <w:sz w:val="22"/>
+              </w:rPr>
+              <w:t xml:space="preserve"> </w:t>
+            </w:r>
+            <w:r>
+              <w:rPr>
+                <w:sz w:val="22"/>
+              </w:rPr>
+              <w:t xml:space="preserve">“</w:t>
+            </w:r>
+            <w:r>
+              <w:rPr>
+                <w:sz w:val="22"/>
+              </w:rPr>
+              <w:t xml:space="preserve">Design-Principles Workshop — Kickoff</w:t>
+            </w:r>
+            <w:r>
+              <w:rPr>
+                <w:sz w:val="22"/>
+              </w:rPr>
+              <w:t xml:space="preserve">”</w:t>
+            </w:r>
+            <w:r>
+              <w:rPr>
+                <w:sz w:val="22"/>
+              </w:rPr>
+              <w:t xml:space="preserve"> </w:t>
+            </w:r>
+            <w:r>
+              <w:rPr>
+                <w:sz w:val="22"/>
+              </w:rPr>
+              <w:t xml:space="preserve">· Logged by: Driss El Amrani · Body:</w:t>
+            </w:r>
+            <w:r>
+              <w:rPr>
+                <w:sz w:val="22"/>
+              </w:rPr>
+              <w:t xml:space="preserve"> </w:t>
+            </w:r>
+            <w:r>
+              <w:rPr>
+                <w:sz w:val="22"/>
+              </w:rPr>
+              <w:t xml:space="preserve">“</w:t>
+            </w:r>
+            <w:r>
+              <w:rPr>
+                <w:sz w:val="22"/>
+              </w:rPr>
+              <w:t xml:space="preserve">ITL and Functional Process Owners drafted 5–8 non-negotiable constraints; Change Management flagged Principle 2 as a direct conflict-resolver for the Kenitra/Settat workaround pattern logged in Discovery.</w:t>
+            </w:r>
+            <w:r>
+              <w:rPr>
+                <w:sz w:val="22"/>
+              </w:rPr>
+              <w:t xml:space="preserve">”</w:t>
+            </w:r>
+            <w:r>
+              <w:rPr>
+                <w:sz w:val="22"/>
+              </w:rPr>
+              <w:t xml:space="preserve"> </w:t>
+            </w:r>
+            <w:r>
+              <w:rPr>
+                <w:sz w:val="22"/>
+              </w:rPr>
+              <w:t xml:space="preserve">· Related module: none yet — becomes the Week 7 M17 (WBS &amp; Gantt) Future-State Process Mapping entry.</w:t>
             </w:r>
           </w:p>
         </w:tc>
@@ -14462,7 +14822,79 @@
               <w:rPr>
                 <w:sz w:val="22"/>
               </w:rPr>
-              <w:t xml:space="preserve">No journi entry yet — Steering Committee sign-off recorded outside journi, referenced in the Week 9 M8 (Communications) entry.</w:t>
+              <w:t xml:space="preserve">M21 (Field Notes) — type in: Category: Sign-Off · Title:</w:t>
+            </w:r>
+            <w:r>
+              <w:rPr>
+                <w:sz w:val="22"/>
+              </w:rPr>
+              <w:t xml:space="preserve"> </w:t>
+            </w:r>
+            <w:r>
+              <w:rPr>
+                <w:sz w:val="22"/>
+              </w:rPr>
+              <w:t xml:space="preserve">“</w:t>
+            </w:r>
+            <w:r>
+              <w:rPr>
+                <w:sz w:val="22"/>
+              </w:rPr>
+              <w:t xml:space="preserve">Steering Committee Sign-Off — Design Principles &amp; Future-State Process Maps</w:t>
+            </w:r>
+            <w:r>
+              <w:rPr>
+                <w:sz w:val="22"/>
+              </w:rPr>
+              <w:t xml:space="preserve">”</w:t>
+            </w:r>
+            <w:r>
+              <w:rPr>
+                <w:sz w:val="22"/>
+              </w:rPr>
+              <w:t xml:space="preserve"> </w:t>
+            </w:r>
+            <w:r>
+              <w:rPr>
+                <w:sz w:val="22"/>
+              </w:rPr>
+              <w:t xml:space="preserve">· Logged by: Driss El Amrani · Body:</w:t>
+            </w:r>
+            <w:r>
+              <w:rPr>
+                <w:sz w:val="22"/>
+              </w:rPr>
+              <w:t xml:space="preserve"> </w:t>
+            </w:r>
+            <w:r>
+              <w:rPr>
+                <w:sz w:val="22"/>
+              </w:rPr>
+              <w:t xml:space="preserve">“</w:t>
+            </w:r>
+            <w:r>
+              <w:rPr>
+                <w:sz w:val="22"/>
+              </w:rPr>
+              <w:t xml:space="preserve">Unanimous sign-off recorded 08 [date]; no dissent. Clears Communications to launch the Week 9 kickoff town hall.</w:t>
+            </w:r>
+            <w:r>
+              <w:rPr>
+                <w:sz w:val="22"/>
+              </w:rPr>
+              <w:t xml:space="preserve">”</w:t>
+            </w:r>
+            <w:r>
+              <w:rPr>
+                <w:sz w:val="22"/>
+              </w:rPr>
+              <w:t xml:space="preserve"> </w:t>
+            </w:r>
+            <w:r>
+              <w:rPr>
+                <w:sz w:val="22"/>
+              </w:rPr>
+              <w:t xml:space="preserve">· Related module: M17 (WBS &amp; Gantt).</w:t>
             </w:r>
           </w:p>
         </w:tc>
@@ -15359,7 +15791,79 @@
               <w:rPr>
                 <w:sz w:val="22"/>
               </w:rPr>
-              <w:t xml:space="preserve">No journi entry yet — nominees confirmed with their managers before Week 14’s roster entry.</w:t>
+              <w:t xml:space="preserve">M21 (Field Notes) — type in: Category: Nomination · Title:</w:t>
+            </w:r>
+            <w:r>
+              <w:rPr>
+                <w:sz w:val="22"/>
+              </w:rPr>
+              <w:t xml:space="preserve"> </w:t>
+            </w:r>
+            <w:r>
+              <w:rPr>
+                <w:sz w:val="22"/>
+              </w:rPr>
+              <w:t xml:space="preserve">“</w:t>
+            </w:r>
+            <w:r>
+              <w:rPr>
+                <w:sz w:val="22"/>
+              </w:rPr>
+              <w:t xml:space="preserve">Champion Nominees — Draft List</w:t>
+            </w:r>
+            <w:r>
+              <w:rPr>
+                <w:sz w:val="22"/>
+              </w:rPr>
+              <w:t xml:space="preserve">”</w:t>
+            </w:r>
+            <w:r>
+              <w:rPr>
+                <w:sz w:val="22"/>
+              </w:rPr>
+              <w:t xml:space="preserve"> </w:t>
+            </w:r>
+            <w:r>
+              <w:rPr>
+                <w:sz w:val="22"/>
+              </w:rPr>
+              <w:t xml:space="preserve">· Logged by: Driss El Amrani · Body:</w:t>
+            </w:r>
+            <w:r>
+              <w:rPr>
+                <w:sz w:val="22"/>
+              </w:rPr>
+              <w:t xml:space="preserve"> </w:t>
+            </w:r>
+            <w:r>
+              <w:rPr>
+                <w:sz w:val="22"/>
+              </w:rPr>
+              <w:t xml:space="preserve">“</w:t>
+            </w:r>
+            <w:r>
+              <w:rPr>
+                <w:sz w:val="22"/>
+              </w:rPr>
+              <w:t xml:space="preserve">Casablanca Finance: Amal Ferhati. Kenitra Plant Operations: Yassine Bouhali (night shift). Settat Plant Operations: Rania Idrissi. Pending manager confirmation before the Week 14 roster entry on M4 (Stakeholder Mapping).</w:t>
+            </w:r>
+            <w:r>
+              <w:rPr>
+                <w:sz w:val="22"/>
+              </w:rPr>
+              <w:t xml:space="preserve">”</w:t>
+            </w:r>
+            <w:r>
+              <w:rPr>
+                <w:sz w:val="22"/>
+              </w:rPr>
+              <w:t xml:space="preserve"> </w:t>
+            </w:r>
+            <w:r>
+              <w:rPr>
+                <w:sz w:val="22"/>
+              </w:rPr>
+              <w:t xml:space="preserve">· Related module: M4 (Stakeholder Mapping).</w:t>
             </w:r>
           </w:p>
         </w:tc>
@@ -16577,7 +17081,79 @@
               <w:rPr>
                 <w:sz w:val="22"/>
               </w:rPr>
-              <w:t xml:space="preserve">No direct journi entry — the briefing itself is a facilitated session; its output (an observation-logging habit) shows up as future M4 (Stakeholder Mapping) and M10 (Resistance) entries once champions actually log something.</w:t>
+              <w:t xml:space="preserve">M21 (Field Notes) — type in: Category: Workshop · Title:</w:t>
+            </w:r>
+            <w:r>
+              <w:rPr>
+                <w:sz w:val="22"/>
+              </w:rPr>
+              <w:t xml:space="preserve"> </w:t>
+            </w:r>
+            <w:r>
+              <w:rPr>
+                <w:sz w:val="22"/>
+              </w:rPr>
+              <w:t xml:space="preserve">“</w:t>
+            </w:r>
+            <w:r>
+              <w:rPr>
+                <w:sz w:val="22"/>
+              </w:rPr>
+              <w:t xml:space="preserve">Champion Briefing Session, All 3 Sites</w:t>
+            </w:r>
+            <w:r>
+              <w:rPr>
+                <w:sz w:val="22"/>
+              </w:rPr>
+              <w:t xml:space="preserve">”</w:t>
+            </w:r>
+            <w:r>
+              <w:rPr>
+                <w:sz w:val="22"/>
+              </w:rPr>
+              <w:t xml:space="preserve"> </w:t>
+            </w:r>
+            <w:r>
+              <w:rPr>
+                <w:sz w:val="22"/>
+              </w:rPr>
+              <w:t xml:space="preserve">· Logged by: Driss El Amrani · Body:</w:t>
+            </w:r>
+            <w:r>
+              <w:rPr>
+                <w:sz w:val="22"/>
+              </w:rPr>
+              <w:t xml:space="preserve"> </w:t>
+            </w:r>
+            <w:r>
+              <w:rPr>
+                <w:sz w:val="22"/>
+              </w:rPr>
+              <w:t xml:space="preserve">“</w:t>
+            </w:r>
+            <w:r>
+              <w:rPr>
+                <w:sz w:val="22"/>
+              </w:rPr>
+              <w:t xml:space="preserve">Briefed Amal Ferhati, Yassine Bouhali, and Rania Idrissi on floor-level observation and what’s worth logging. Facilitated session; output shows up as future M4 (Stakeholder Mapping) and M10 (Resistance) entries once champions actually log something.</w:t>
+            </w:r>
+            <w:r>
+              <w:rPr>
+                <w:sz w:val="22"/>
+              </w:rPr>
+              <w:t xml:space="preserve">”</w:t>
+            </w:r>
+            <w:r>
+              <w:rPr>
+                <w:sz w:val="22"/>
+              </w:rPr>
+              <w:t xml:space="preserve"> </w:t>
+            </w:r>
+            <w:r>
+              <w:rPr>
+                <w:sz w:val="22"/>
+              </w:rPr>
+              <w:t xml:space="preserve">· Related module: M4 (Stakeholder Mapping).</w:t>
             </w:r>
           </w:p>
         </w:tc>
@@ -17105,7 +17681,79 @@
               <w:rPr>
                 <w:sz w:val="22"/>
               </w:rPr>
-              <w:t xml:space="preserve">No new journi entry this week — findings feed the Week 21 response design.</w:t>
+              <w:t xml:space="preserve">M21 (Field Notes) — type in: Category: Workshop · Title:</w:t>
+            </w:r>
+            <w:r>
+              <w:rPr>
+                <w:sz w:val="22"/>
+              </w:rPr>
+              <w:t xml:space="preserve"> </w:t>
+            </w:r>
+            <w:r>
+              <w:rPr>
+                <w:sz w:val="22"/>
+              </w:rPr>
+              <w:t xml:space="preserve">“</w:t>
+            </w:r>
+            <w:r>
+              <w:rPr>
+                <w:sz w:val="22"/>
+              </w:rPr>
+              <w:t xml:space="preserve">E1 Recovery Task 2 — Settat Targeted Listening Sessions</w:t>
+            </w:r>
+            <w:r>
+              <w:rPr>
+                <w:sz w:val="22"/>
+              </w:rPr>
+              <w:t xml:space="preserve">”</w:t>
+            </w:r>
+            <w:r>
+              <w:rPr>
+                <w:sz w:val="22"/>
+              </w:rPr>
+              <w:t xml:space="preserve"> </w:t>
+            </w:r>
+            <w:r>
+              <w:rPr>
+                <w:sz w:val="22"/>
+              </w:rPr>
+              <w:t xml:space="preserve">· Logged by: Houda Zerouali · Body:</w:t>
+            </w:r>
+            <w:r>
+              <w:rPr>
+                <w:sz w:val="22"/>
+              </w:rPr>
+              <w:t xml:space="preserve"> </w:t>
+            </w:r>
+            <w:r>
+              <w:rPr>
+                <w:sz w:val="22"/>
+              </w:rPr>
+              <w:t xml:space="preserve">“</w:t>
+            </w:r>
+            <w:r>
+              <w:rPr>
+                <w:sz w:val="22"/>
+              </w:rPr>
+              <w:t xml:space="preserve">Small-group sessions with the Settat plant-floor cohort confirm position security, not workflow visibility, is the primary driver of the Desire stall. Feeds the Week 21 response design.</w:t>
+            </w:r>
+            <w:r>
+              <w:rPr>
+                <w:sz w:val="22"/>
+              </w:rPr>
+              <w:t xml:space="preserve">”</w:t>
+            </w:r>
+            <w:r>
+              <w:rPr>
+                <w:sz w:val="22"/>
+              </w:rPr>
+              <w:t xml:space="preserve"> </w:t>
+            </w:r>
+            <w:r>
+              <w:rPr>
+                <w:sz w:val="22"/>
+              </w:rPr>
+              <w:t xml:space="preserve">· Related module: none yet — feeds the Week 24 M5 (ADKAR Engine)/M6 (Emotional &amp; Transition Layer) re-score.</w:t>
             </w:r>
           </w:p>
         </w:tc>
@@ -17222,7 +17870,79 @@
               <w:rPr>
                 <w:sz w:val="22"/>
               </w:rPr>
-              <w:t xml:space="preserve">No new journi entry this week.</w:t>
+              <w:t xml:space="preserve">M21 (Field Notes) — type in: Category: Decision · Title:</w:t>
+            </w:r>
+            <w:r>
+              <w:rPr>
+                <w:sz w:val="22"/>
+              </w:rPr>
+              <w:t xml:space="preserve"> </w:t>
+            </w:r>
+            <w:r>
+              <w:rPr>
+                <w:sz w:val="22"/>
+              </w:rPr>
+              <w:t xml:space="preserve">“</w:t>
+            </w:r>
+            <w:r>
+              <w:rPr>
+                <w:sz w:val="22"/>
+              </w:rPr>
+              <w:t xml:space="preserve">E1 Recovery Task 3 — Staffing Commitment Designed</w:t>
+            </w:r>
+            <w:r>
+              <w:rPr>
+                <w:sz w:val="22"/>
+              </w:rPr>
+              <w:t xml:space="preserve">”</w:t>
+            </w:r>
+            <w:r>
+              <w:rPr>
+                <w:sz w:val="22"/>
+              </w:rPr>
+              <w:t xml:space="preserve"> </w:t>
+            </w:r>
+            <w:r>
+              <w:rPr>
+                <w:sz w:val="22"/>
+              </w:rPr>
+              <w:t xml:space="preserve">· Logged by: Driss El Amrani · Body:</w:t>
+            </w:r>
+            <w:r>
+              <w:rPr>
+                <w:sz w:val="22"/>
+              </w:rPr>
+              <w:t xml:space="preserve"> </w:t>
+            </w:r>
+            <w:r>
+              <w:rPr>
+                <w:sz w:val="22"/>
+              </w:rPr>
+              <w:t xml:space="preserve">“</w:t>
+            </w:r>
+            <w:r>
+              <w:rPr>
+                <w:sz w:val="22"/>
+              </w:rPr>
+              <w:t xml:space="preserve">Agreed with the CFO: a specific, verifiable commitment on post-go-live staffing levels for the Settat plant-floor cohort — not a vague reassurance. Delivery scheduled for Week 22.</w:t>
+            </w:r>
+            <w:r>
+              <w:rPr>
+                <w:sz w:val="22"/>
+              </w:rPr>
+              <w:t xml:space="preserve">”</w:t>
+            </w:r>
+            <w:r>
+              <w:rPr>
+                <w:sz w:val="22"/>
+              </w:rPr>
+              <w:t xml:space="preserve"> </w:t>
+            </w:r>
+            <w:r>
+              <w:rPr>
+                <w:sz w:val="22"/>
+              </w:rPr>
+              <w:t xml:space="preserve">· Related module: M7 (Sponsor &amp; Coalition).</w:t>
             </w:r>
           </w:p>
         </w:tc>
@@ -17960,7 +18680,79 @@
               <w:rPr>
                 <w:sz w:val="22"/>
               </w:rPr>
-              <w:t xml:space="preserve">No journi entry this week.</w:t>
+              <w:t xml:space="preserve">M21 (Field Notes) — type in: Category: Decision · Title:</w:t>
+            </w:r>
+            <w:r>
+              <w:rPr>
+                <w:sz w:val="22"/>
+              </w:rPr>
+              <w:t xml:space="preserve"> </w:t>
+            </w:r>
+            <w:r>
+              <w:rPr>
+                <w:sz w:val="22"/>
+              </w:rPr>
+              <w:t xml:space="preserve">“</w:t>
+            </w:r>
+            <w:r>
+              <w:rPr>
+                <w:sz w:val="22"/>
+              </w:rPr>
+              <w:t xml:space="preserve">Lewin Phase-Call Draft — Steering Committee Pre-Review</w:t>
+            </w:r>
+            <w:r>
+              <w:rPr>
+                <w:sz w:val="22"/>
+              </w:rPr>
+              <w:t xml:space="preserve">”</w:t>
+            </w:r>
+            <w:r>
+              <w:rPr>
+                <w:sz w:val="22"/>
+              </w:rPr>
+              <w:t xml:space="preserve"> </w:t>
+            </w:r>
+            <w:r>
+              <w:rPr>
+                <w:sz w:val="22"/>
+              </w:rPr>
+              <w:t xml:space="preserve">· Logged by: Driss El Amrani · Body:</w:t>
+            </w:r>
+            <w:r>
+              <w:rPr>
+                <w:sz w:val="22"/>
+              </w:rPr>
+              <w:t xml:space="preserve"> </w:t>
+            </w:r>
+            <w:r>
+              <w:rPr>
+                <w:sz w:val="22"/>
+              </w:rPr>
+              <w:t xml:space="preserve">“</w:t>
+            </w:r>
+            <w:r>
+              <w:rPr>
+                <w:sz w:val="22"/>
+              </w:rPr>
+              <w:t xml:space="preserve">Drafted the Unfreeze-to-Change justification ahead of the Week 29 formal call: five configuration sprints complete, Desire trending upward across all three sites including Settat’s recovery. Circulated for pre-review, not yet the formal M3 (Initiative Registry) entry.</w:t>
+            </w:r>
+            <w:r>
+              <w:rPr>
+                <w:sz w:val="22"/>
+              </w:rPr>
+              <w:t xml:space="preserve">”</w:t>
+            </w:r>
+            <w:r>
+              <w:rPr>
+                <w:sz w:val="22"/>
+              </w:rPr>
+              <w:t xml:space="preserve"> </w:t>
+            </w:r>
+            <w:r>
+              <w:rPr>
+                <w:sz w:val="22"/>
+              </w:rPr>
+              <w:t xml:space="preserve">· Related module: M3 (Initiative Registry).</w:t>
             </w:r>
           </w:p>
         </w:tc>
@@ -18077,7 +18869,79 @@
               <w:rPr>
                 <w:sz w:val="22"/>
               </w:rPr>
-              <w:t xml:space="preserve">No journi entry this week — evidence review is a facilitated session ahead of the Week 29 phase-call entry.</w:t>
+              <w:t xml:space="preserve">M21 (Field Notes) — type in: Category: Decision · Title:</w:t>
+            </w:r>
+            <w:r>
+              <w:rPr>
+                <w:sz w:val="22"/>
+              </w:rPr>
+              <w:t xml:space="preserve"> </w:t>
+            </w:r>
+            <w:r>
+              <w:rPr>
+                <w:sz w:val="22"/>
+              </w:rPr>
+              <w:t xml:space="preserve">“</w:t>
+            </w:r>
+            <w:r>
+              <w:rPr>
+                <w:sz w:val="22"/>
+              </w:rPr>
+              <w:t xml:space="preserve">Evidence Review vs. Signal Catalogue</w:t>
+            </w:r>
+            <w:r>
+              <w:rPr>
+                <w:sz w:val="22"/>
+              </w:rPr>
+              <w:t xml:space="preserve">”</w:t>
+            </w:r>
+            <w:r>
+              <w:rPr>
+                <w:sz w:val="22"/>
+              </w:rPr>
+              <w:t xml:space="preserve"> </w:t>
+            </w:r>
+            <w:r>
+              <w:rPr>
+                <w:sz w:val="22"/>
+              </w:rPr>
+              <w:t xml:space="preserve">· Logged by: Driss El Amrani · Body:</w:t>
+            </w:r>
+            <w:r>
+              <w:rPr>
+                <w:sz w:val="22"/>
+              </w:rPr>
+              <w:t xml:space="preserve"> </w:t>
+            </w:r>
+            <w:r>
+              <w:rPr>
+                <w:sz w:val="22"/>
+              </w:rPr>
+              <w:t xml:space="preserve">“</w:t>
+            </w:r>
+            <w:r>
+              <w:rPr>
+                <w:sz w:val="22"/>
+              </w:rPr>
+              <w:t xml:space="preserve">Confirmed against Section 1B.1’s signal catalogue: configuration sprints landed, Desire trended upward including Settat’s recovery, no cohort remains below a Desire of 3. Facilitated session ahead of the Week 29 formal Lewin call.</w:t>
+            </w:r>
+            <w:r>
+              <w:rPr>
+                <w:sz w:val="22"/>
+              </w:rPr>
+              <w:t xml:space="preserve">”</w:t>
+            </w:r>
+            <w:r>
+              <w:rPr>
+                <w:sz w:val="22"/>
+              </w:rPr>
+              <w:t xml:space="preserve"> </w:t>
+            </w:r>
+            <w:r>
+              <w:rPr>
+                <w:sz w:val="22"/>
+              </w:rPr>
+              <w:t xml:space="preserve">· Related module: M3 (Initiative Registry).</w:t>
             </w:r>
           </w:p>
         </w:tc>
@@ -19022,7 +19886,79 @@
               <w:rPr>
                 <w:sz w:val="22"/>
               </w:rPr>
-              <w:t xml:space="preserve">No journi entry yet — names confirmed with site managers before the Week 31 roster entry.</w:t>
+              <w:t xml:space="preserve">M21 (Field Notes) — type in: Category: Nomination · Title:</w:t>
+            </w:r>
+            <w:r>
+              <w:rPr>
+                <w:sz w:val="22"/>
+              </w:rPr>
+              <w:t xml:space="preserve"> </w:t>
+            </w:r>
+            <w:r>
+              <w:rPr>
+                <w:sz w:val="22"/>
+              </w:rPr>
+              <w:t xml:space="preserve">“</w:t>
+            </w:r>
+            <w:r>
+              <w:rPr>
+                <w:sz w:val="22"/>
+              </w:rPr>
+              <w:t xml:space="preserve">UAT Participant Names — Draft</w:t>
+            </w:r>
+            <w:r>
+              <w:rPr>
+                <w:sz w:val="22"/>
+              </w:rPr>
+              <w:t xml:space="preserve">”</w:t>
+            </w:r>
+            <w:r>
+              <w:rPr>
+                <w:sz w:val="22"/>
+              </w:rPr>
+              <w:t xml:space="preserve"> </w:t>
+            </w:r>
+            <w:r>
+              <w:rPr>
+                <w:sz w:val="22"/>
+              </w:rPr>
+              <w:t xml:space="preserve">· Logged by: Driss El Amrani · Body:</w:t>
+            </w:r>
+            <w:r>
+              <w:rPr>
+                <w:sz w:val="22"/>
+              </w:rPr>
+              <w:t xml:space="preserve"> </w:t>
+            </w:r>
+            <w:r>
+              <w:rPr>
+                <w:sz w:val="22"/>
+              </w:rPr>
+              <w:t xml:space="preserve">“</w:t>
+            </w:r>
+            <w:r>
+              <w:rPr>
+                <w:sz w:val="22"/>
+              </w:rPr>
+              <w:t xml:space="preserve">5 Casablanca Finance, 3 Kenitra Plant Operations, 3 Settat Plant Operations — names selected, pending site-manager confirmation before the Week 31 roster entry on M4 (Stakeholder Mapping).</w:t>
+            </w:r>
+            <w:r>
+              <w:rPr>
+                <w:sz w:val="22"/>
+              </w:rPr>
+              <w:t xml:space="preserve">”</w:t>
+            </w:r>
+            <w:r>
+              <w:rPr>
+                <w:sz w:val="22"/>
+              </w:rPr>
+              <w:t xml:space="preserve"> </w:t>
+            </w:r>
+            <w:r>
+              <w:rPr>
+                <w:sz w:val="22"/>
+              </w:rPr>
+              <w:t xml:space="preserve">· Related module: M4 (Stakeholder Mapping).</w:t>
             </w:r>
           </w:p>
         </w:tc>
@@ -20987,7 +21923,79 @@
               <w:rPr>
                 <w:sz w:val="22"/>
               </w:rPr>
-              <w:t xml:space="preserve">No direct journi entry — job aids are distributed as documents, referenced by name in M9 (Training) curriculum notes.</w:t>
+              <w:t xml:space="preserve">M21 (Field Notes) — type in: Category: Handoff · Title:</w:t>
+            </w:r>
+            <w:r>
+              <w:rPr>
+                <w:sz w:val="22"/>
+              </w:rPr>
+              <w:t xml:space="preserve"> </w:t>
+            </w:r>
+            <w:r>
+              <w:rPr>
+                <w:sz w:val="22"/>
+              </w:rPr>
+              <w:t xml:space="preserve">“</w:t>
+            </w:r>
+            <w:r>
+              <w:rPr>
+                <w:sz w:val="22"/>
+              </w:rPr>
+              <w:t xml:space="preserve">Job Aids Published, All Roles</w:t>
+            </w:r>
+            <w:r>
+              <w:rPr>
+                <w:sz w:val="22"/>
+              </w:rPr>
+              <w:t xml:space="preserve">”</w:t>
+            </w:r>
+            <w:r>
+              <w:rPr>
+                <w:sz w:val="22"/>
+              </w:rPr>
+              <w:t xml:space="preserve"> </w:t>
+            </w:r>
+            <w:r>
+              <w:rPr>
+                <w:sz w:val="22"/>
+              </w:rPr>
+              <w:t xml:space="preserve">· Logged by: Driss El Amrani · Body:</w:t>
+            </w:r>
+            <w:r>
+              <w:rPr>
+                <w:sz w:val="22"/>
+              </w:rPr>
+              <w:t xml:space="preserve"> </w:t>
+            </w:r>
+            <w:r>
+              <w:rPr>
+                <w:sz w:val="22"/>
+              </w:rPr>
+              <w:t xml:space="preserve">“</w:t>
+            </w:r>
+            <w:r>
+              <w:rPr>
+                <w:sz w:val="22"/>
+              </w:rPr>
+              <w:t xml:space="preserve">Job aids formatted and distributed by ITL, one per role, reviewed for accuracy against the curriculum and Build-phase design principles. Distributed as documents; referenced by name in M9 (Training) curriculum notes.</w:t>
+            </w:r>
+            <w:r>
+              <w:rPr>
+                <w:sz w:val="22"/>
+              </w:rPr>
+              <w:t xml:space="preserve">”</w:t>
+            </w:r>
+            <w:r>
+              <w:rPr>
+                <w:sz w:val="22"/>
+              </w:rPr>
+              <w:t xml:space="preserve"> </w:t>
+            </w:r>
+            <w:r>
+              <w:rPr>
+                <w:sz w:val="22"/>
+              </w:rPr>
+              <w:t xml:space="preserve">· Related module: M9 (Training).</w:t>
             </w:r>
           </w:p>
         </w:tc>
@@ -24584,7 +25592,79 @@
               <w:rPr>
                 <w:sz w:val="22"/>
               </w:rPr>
-              <w:t xml:space="preserve">No direct journi entry — metrics agreed with HR outside journi, referenced in the Week 52 confirmation.</w:t>
+              <w:t xml:space="preserve">M21 (Field Notes) — type in: Category: Decision · Title:</w:t>
+            </w:r>
+            <w:r>
+              <w:rPr>
+                <w:sz w:val="22"/>
+              </w:rPr>
+              <w:t xml:space="preserve"> </w:t>
+            </w:r>
+            <w:r>
+              <w:rPr>
+                <w:sz w:val="22"/>
+              </w:rPr>
+              <w:t xml:space="preserve">“</w:t>
+            </w:r>
+            <w:r>
+              <w:rPr>
+                <w:sz w:val="22"/>
+              </w:rPr>
+              <w:t xml:space="preserve">New-Process Metrics Agreed with HR</w:t>
+            </w:r>
+            <w:r>
+              <w:rPr>
+                <w:sz w:val="22"/>
+              </w:rPr>
+              <w:t xml:space="preserve">”</w:t>
+            </w:r>
+            <w:r>
+              <w:rPr>
+                <w:sz w:val="22"/>
+              </w:rPr>
+              <w:t xml:space="preserve"> </w:t>
+            </w:r>
+            <w:r>
+              <w:rPr>
+                <w:sz w:val="22"/>
+              </w:rPr>
+              <w:t xml:space="preserve">· Logged by: Houda Zerouali · Body:</w:t>
+            </w:r>
+            <w:r>
+              <w:rPr>
+                <w:sz w:val="22"/>
+              </w:rPr>
+              <w:t xml:space="preserve"> </w:t>
+            </w:r>
+            <w:r>
+              <w:rPr>
+                <w:sz w:val="22"/>
+              </w:rPr>
+              <w:t xml:space="preserve">“</w:t>
+            </w:r>
+            <w:r>
+              <w:rPr>
+                <w:sz w:val="22"/>
+              </w:rPr>
+              <w:t xml:space="preserve">Order-to-cash cycle time (target: under 3 days); inventory reconciliation accuracy (target: 99%); duplicate-entry incidents (target: 0/month) — agreed with HR outside journi. Confirmed live in the next review cycle, Week 52.</w:t>
+            </w:r>
+            <w:r>
+              <w:rPr>
+                <w:sz w:val="22"/>
+              </w:rPr>
+              <w:t xml:space="preserve">”</w:t>
+            </w:r>
+            <w:r>
+              <w:rPr>
+                <w:sz w:val="22"/>
+              </w:rPr>
+              <w:t xml:space="preserve"> </w:t>
+            </w:r>
+            <w:r>
+              <w:rPr>
+                <w:sz w:val="22"/>
+              </w:rPr>
+              <w:t xml:space="preserve">· Related module: M12 (Sustainment).</w:t>
             </w:r>
           </w:p>
         </w:tc>
@@ -25913,7 +26993,79 @@
               <w:rPr>
                 <w:sz w:val="22"/>
               </w:rPr>
-              <w:t xml:space="preserve">No direct journi entry — coordinated with HR outside journi.</w:t>
+              <w:t xml:space="preserve">M21 (Field Notes) — type in: Category: Handoff · Title:</w:t>
+            </w:r>
+            <w:r>
+              <w:rPr>
+                <w:sz w:val="22"/>
+              </w:rPr>
+              <w:t xml:space="preserve"> </w:t>
+            </w:r>
+            <w:r>
+              <w:rPr>
+                <w:sz w:val="22"/>
+              </w:rPr>
+              <w:t xml:space="preserve">“</w:t>
+            </w:r>
+            <w:r>
+              <w:rPr>
+                <w:sz w:val="22"/>
+              </w:rPr>
+              <w:t xml:space="preserve">E5 Recovery Task 4 — Reinforcement Embedded in HR Performance-Review Cycle</w:t>
+            </w:r>
+            <w:r>
+              <w:rPr>
+                <w:sz w:val="22"/>
+              </w:rPr>
+              <w:t xml:space="preserve">”</w:t>
+            </w:r>
+            <w:r>
+              <w:rPr>
+                <w:sz w:val="22"/>
+              </w:rPr>
+              <w:t xml:space="preserve"> </w:t>
+            </w:r>
+            <w:r>
+              <w:rPr>
+                <w:sz w:val="22"/>
+              </w:rPr>
+              <w:t xml:space="preserve">· Logged by: Houda Zerouali · Body:</w:t>
+            </w:r>
+            <w:r>
+              <w:rPr>
+                <w:sz w:val="22"/>
+              </w:rPr>
+              <w:t xml:space="preserve"> </w:t>
+            </w:r>
+            <w:r>
+              <w:rPr>
+                <w:sz w:val="22"/>
+              </w:rPr>
+              <w:t xml:space="preserve">“</w:t>
+            </w:r>
+            <w:r>
+              <w:rPr>
+                <w:sz w:val="22"/>
+              </w:rPr>
+              <w:t xml:space="preserve">Adoption metrics embedded into the next performance-review cycle, giving Reinforcement a structural home in HR’s cycle beyond the CM project’s own lifespan. Coordinated with HR outside journi.</w:t>
+            </w:r>
+            <w:r>
+              <w:rPr>
+                <w:sz w:val="22"/>
+              </w:rPr>
+              <w:t xml:space="preserve">”</w:t>
+            </w:r>
+            <w:r>
+              <w:rPr>
+                <w:sz w:val="22"/>
+              </w:rPr>
+              <w:t xml:space="preserve"> </w:t>
+            </w:r>
+            <w:r>
+              <w:rPr>
+                <w:sz w:val="22"/>
+              </w:rPr>
+              <w:t xml:space="preserve">· Related module: M12 (Sustainment).</w:t>
             </w:r>
           </w:p>
         </w:tc>
@@ -50262,7 +51414,7 @@
     </w:p>
     <w:bookmarkEnd w:id="56"/>
     <w:bookmarkEnd w:id="57"/>
-    <w:bookmarkStart w:id="78" w:name="part-2-module-by-module-feature-tour"/>
+    <w:bookmarkStart w:id="79" w:name="part-2-module-by-module-feature-tour"/>
     <w:p>
       <w:pPr>
         <w:pStyle w:val="Heading2"/>
@@ -53209,6 +54361,182 @@
         <w:t xml:space="preserve">Journey touchpoint; success criterion; logged evidence.</w:t>
       </w:r>
     </w:p>
+    <w:bookmarkEnd w:id="77"/>
+    <w:bookmarkStart w:id="78" w:name="m21-field-notes"/>
+    <w:p>
+      <w:pPr>
+        <w:pStyle w:val="Heading3"/>
+      </w:pPr>
+      <w:r>
+        <w:rPr>
+          <w:b/>
+          <w:color w:val="3F827B"/>
+          <w:sz w:val="29"/>
+        </w:rPr>
+        <w:t xml:space="preserve">M21 — Field Notes</w:t>
+      </w:r>
+    </w:p>
+    <w:p>
+      <w:pPr>
+        <w:pStyle w:val="FirstParagraph"/>
+      </w:pPr>
+      <w:r>
+        <w:rPr>
+          <w:bCs/>
+          <w:b/>
+          <w:sz w:val="25"/>
+        </w:rPr>
+        <w:t xml:space="preserve">Purpose:</w:t>
+      </w:r>
+      <w:r>
+        <w:rPr>
+          <w:sz w:val="25"/>
+        </w:rPr>
+        <w:t xml:space="preserve"> </w:t>
+      </w:r>
+      <w:r>
+        <w:rPr>
+          <w:sz w:val="25"/>
+        </w:rPr>
+        <w:t xml:space="preserve">a lightweight, freeform log for the knowledge that Part 1B’s week-by-week tables keep surfacing but no structured module has a field for yet — a workshop happened, a decision was made outside journi, a sign-off landed, a nominee list was drafted. Not a substitute for the structured modules: once something becomes a real record there (a Stakeholder Map entry, an ADKAR score, a Communication), it belongs there instead. Field Notes is for the moments in between, so that knowledge doesn’t just get lost between the meeting where it happened and the module entry it eventually becomes.</w:t>
+      </w:r>
+    </w:p>
+    <w:p>
+      <w:pPr>
+        <w:pStyle w:val="BodyText"/>
+      </w:pPr>
+      <w:r>
+        <w:rPr>
+          <w:bCs/>
+          <w:b/>
+          <w:sz w:val="25"/>
+        </w:rPr>
+        <w:t xml:space="preserve">In the Bouregreg scenario:</w:t>
+      </w:r>
+      <w:r>
+        <w:rPr>
+          <w:sz w:val="25"/>
+        </w:rPr>
+        <w:t xml:space="preserve"> </w:t>
+      </w:r>
+      <w:r>
+        <w:rPr>
+          <w:sz w:val="25"/>
+        </w:rPr>
+        <w:t xml:space="preserve">every Part 1B week that used to read</w:t>
+      </w:r>
+      <w:r>
+        <w:rPr>
+          <w:sz w:val="25"/>
+        </w:rPr>
+        <w:t xml:space="preserve"> </w:t>
+      </w:r>
+      <w:r>
+        <w:rPr>
+          <w:sz w:val="25"/>
+        </w:rPr>
+        <w:t xml:space="preserve">“</w:t>
+      </w:r>
+      <w:r>
+        <w:rPr>
+          <w:sz w:val="25"/>
+        </w:rPr>
+        <w:t xml:space="preserve">No journi entry yet</w:t>
+      </w:r>
+      <w:r>
+        <w:rPr>
+          <w:sz w:val="25"/>
+        </w:rPr>
+        <w:t xml:space="preserve">”</w:t>
+      </w:r>
+      <w:r>
+        <w:rPr>
+          <w:sz w:val="25"/>
+        </w:rPr>
+        <w:t xml:space="preserve"> </w:t>
+      </w:r>
+      <w:r>
+        <w:rPr>
+          <w:sz w:val="25"/>
+        </w:rPr>
+        <w:t xml:space="preserve">now logs an M21 (Field Notes) entry instead — Discovery Workshop 1 at Casablanca HQ (Week 2), the design-principles workshop (Week 6), the Steering Committee sign-off on principles and future-state maps (Week 8), the champion nominee list before roster confirmation (Week 13), and sixteen more across the 64-week program. A genuine gap remains only where the guide says so explicitly: a handful of weeks where nothing new happened, where the activity is already logged on a different module (the Week 22 sponsor action on M7, for instance), or — deliberately, at Week 35 — where the conversation itself is private and only its outcome belongs in any log. Driss El Amrani and Meryem Sabri use Field Notes as their running field journal for everything else.</w:t>
+      </w:r>
+    </w:p>
+    <w:p>
+      <w:pPr>
+        <w:pStyle w:val="BodyText"/>
+      </w:pPr>
+      <w:r>
+        <w:rPr>
+          <w:bCs/>
+          <w:b/>
+          <w:sz w:val="25"/>
+        </w:rPr>
+        <w:t xml:space="preserve">Create / update / delete:</w:t>
+      </w:r>
+      <w:r>
+        <w:rPr>
+          <w:sz w:val="25"/>
+        </w:rPr>
+        <w:t xml:space="preserve"> </w:t>
+      </w:r>
+      <w:r>
+        <w:rPr>
+          <w:sz w:val="25"/>
+        </w:rPr>
+        <w:t xml:space="preserve">full CRUD on a project’s Field Notes — add a note (date, category, optional linked module, author, body text), edit it, or delete it.</w:t>
+      </w:r>
+    </w:p>
+    <w:p>
+      <w:pPr>
+        <w:pStyle w:val="BodyText"/>
+      </w:pPr>
+      <w:r>
+        <w:rPr>
+          <w:bCs/>
+          <w:b/>
+          <w:sz w:val="25"/>
+        </w:rPr>
+        <w:t xml:space="preserve">Who can edit:</w:t>
+      </w:r>
+      <w:r>
+        <w:rPr>
+          <w:sz w:val="25"/>
+        </w:rPr>
+        <w:t xml:space="preserve"> </w:t>
+      </w:r>
+      <w:r>
+        <w:rPr>
+          <w:sz w:val="25"/>
+        </w:rPr>
+        <w:t xml:space="preserve">general write access, matching Part 2’s other logging-style modules (M12, M20).</w:t>
+      </w:r>
+    </w:p>
+    <w:p>
+      <w:pPr>
+        <w:pStyle w:val="BodyText"/>
+      </w:pPr>
+      <w:r>
+        <w:rPr>
+          <w:bCs/>
+          <w:b/>
+          <w:sz w:val="25"/>
+        </w:rPr>
+        <w:t xml:space="preserve">Key fields:</w:t>
+      </w:r>
+      <w:r>
+        <w:rPr>
+          <w:sz w:val="25"/>
+        </w:rPr>
+        <w:t xml:space="preserve"> </w:t>
+      </w:r>
+      <w:r>
+        <w:rPr>
+          <w:sz w:val="25"/>
+        </w:rPr>
+        <w:t xml:space="preserve">Date; Category (Workshop / Decision / Sign-Off / Nomination / Handoff / Other); Related Module (optional, M1–M20); Logged By; Note body.</w:t>
+      </w:r>
+    </w:p>
     <w:p>
       <w:r>
         <w:rPr>
@@ -53234,9 +54562,9 @@
         <w:pStyle w:val="FirstParagraph"/>
       </w:pPr>
     </w:p>
-    <w:bookmarkEnd w:id="77"/>
     <w:bookmarkEnd w:id="78"/>
-    <w:bookmarkStart w:id="91" w:name="X3a691c7b5e904e251e49707e934744bde62b737"/>
+    <w:bookmarkEnd w:id="79"/>
+    <w:bookmarkStart w:id="92" w:name="X3a691c7b5e904e251e49707e934744bde62b737"/>
     <w:p>
       <w:pPr>
         <w:pStyle w:val="Heading2"/>
@@ -53261,7 +54589,7 @@
         <w:t xml:space="preserve">Module 18’s Process Registry holds 16 registered end-to-end chains: 4 core chains spanning the whole Change Management lifecycle, 4 cross-cutting loops that make an existing cross-module dependency explicit and traceable, and 8 transformation-type lifecycles — one per archetype, each with its own Phase Template in M17. Every chain is built from journi’s 10 Macro Processes (MP-01 through MP-10); this Part walks each of the 16 against Bouregreg Group’s data, and for the 8 transformation-type lifecycles, against the specific Change Management Project in Part 4 that archetype belongs to.</w:t>
       </w:r>
     </w:p>
-    <w:bookmarkStart w:id="79" w:name="the-10-macro-processes-reference"/>
+    <w:bookmarkStart w:id="80" w:name="the-10-macro-processes-reference"/>
     <w:p>
       <w:pPr>
         <w:pStyle w:val="Heading3"/>
@@ -53681,8 +55009,8 @@
         </w:tc>
       </w:tr>
     </w:tbl>
-    <w:bookmarkEnd w:id="79"/>
-    <w:bookmarkStart w:id="84" w:name="core-chains-e2e-01-e2e-04"/>
+    <w:bookmarkEnd w:id="80"/>
+    <w:bookmarkStart w:id="85" w:name="core-chains-e2e-01-e2e-04"/>
     <w:p>
       <w:pPr>
         <w:pStyle w:val="Heading3"/>
@@ -53696,7 +55024,7 @@
         <w:t xml:space="preserve">Core Chains (E2E-01 — E2E-04)</w:t>
       </w:r>
     </w:p>
-    <w:bookmarkStart w:id="80" w:name="Xdd0f15b280f76ef8f06812aee34f7e528fe2da1"/>
+    <w:bookmarkStart w:id="81" w:name="Xdd0f15b280f76ef8f06812aee34f7e528fe2da1"/>
     <w:p>
       <w:pPr>
         <w:pStyle w:val="Heading4"/>
@@ -53863,8 +55191,8 @@
         <w:t xml:space="preserve">W1–14, spanning Discovery and Design (Part 1B.3, Phases 1–2) — the same window Part 1B.6’s Month 1–3 narrative covers.</w:t>
       </w:r>
     </w:p>
-    <w:bookmarkEnd w:id="80"/>
-    <w:bookmarkStart w:id="81" w:name="X102d98e98069ee5353b9ffb28a6892e1ec4d314"/>
+    <w:bookmarkEnd w:id="81"/>
+    <w:bookmarkStart w:id="82" w:name="X102d98e98069ee5353b9ffb28a6892e1ec4d314"/>
     <w:p>
       <w:pPr>
         <w:pStyle w:val="Heading4"/>
@@ -54031,8 +55359,8 @@
         <w:t xml:space="preserve">W28–42, spanning Test and Train (Phases 4–5) — the exact window Exception E2 (Part 1B.4) fires in, Month 8 of Part 1B.6’s narrative.</w:t>
       </w:r>
     </w:p>
-    <w:bookmarkEnd w:id="81"/>
-    <w:bookmarkStart w:id="82" w:name="Xf7155a6f5c22b3c8b7321cba8536c1b62ce4ef0"/>
+    <w:bookmarkEnd w:id="82"/>
+    <w:bookmarkStart w:id="83" w:name="Xf7155a6f5c22b3c8b7321cba8536c1b62ce4ef0"/>
     <w:p>
       <w:pPr>
         <w:pStyle w:val="Heading4"/>
@@ -54199,8 +55527,8 @@
         <w:t xml:space="preserve">first opens W18–22 (Build, Phase 3) with Exception E1, and recurs at any later point a Desire or sentiment score stalls — see also the Order-to-Cash and Settat Restructuring cases in Part 4, both built around this exact chain.</w:t>
       </w:r>
     </w:p>
-    <w:bookmarkEnd w:id="82"/>
-    <w:bookmarkStart w:id="83" w:name="X45b7bee2c9af545f78ba5e1ca9e039e3d7fb2c7"/>
+    <w:bookmarkEnd w:id="83"/>
+    <w:bookmarkStart w:id="84" w:name="X45b7bee2c9af545f78ba5e1ca9e039e3d7fb2c7"/>
     <w:p>
       <w:pPr>
         <w:pStyle w:val="Heading4"/>
@@ -54403,9 +55731,9 @@
         <w:t xml:space="preserve">W43 through W64, spanning Deploy, Hypercare, and Sustain (Phases 6–8) — the closing third of Part 1B.6’s month-by-month narrative, Months 11 through 14.</w:t>
       </w:r>
     </w:p>
-    <w:bookmarkEnd w:id="83"/>
     <w:bookmarkEnd w:id="84"/>
-    <w:bookmarkStart w:id="89" w:name="cross-cutting-loops-e2e-05-e2e-08"/>
+    <w:bookmarkEnd w:id="85"/>
+    <w:bookmarkStart w:id="90" w:name="cross-cutting-loops-e2e-05-e2e-08"/>
     <w:p>
       <w:pPr>
         <w:pStyle w:val="Heading3"/>
@@ -54419,7 +55747,7 @@
         <w:t xml:space="preserve">Cross-Cutting Loops (E2E-05 — E2E-08)</w:t>
       </w:r>
     </w:p>
-    <w:bookmarkStart w:id="85" w:name="e2e-05-signal-aggregation-loop"/>
+    <w:bookmarkStart w:id="86" w:name="e2e-05-signal-aggregation-loop"/>
     <w:p>
       <w:pPr>
         <w:pStyle w:val="Heading4"/>
@@ -54560,8 +55888,8 @@
         <w:t xml:space="preserve">continuous, W1 through close — this loop has no phase of its own because it is the connective tissue running underneath every phase in Part 1B.3.</w:t>
       </w:r>
     </w:p>
-    <w:bookmarkEnd w:id="85"/>
-    <w:bookmarkStart w:id="86" w:name="e2e-06-pm-cm-governance-bridge"/>
+    <w:bookmarkEnd w:id="86"/>
+    <w:bookmarkStart w:id="87" w:name="e2e-06-pm-cm-governance-bridge"/>
     <w:p>
       <w:pPr>
         <w:pStyle w:val="Heading4"/>
@@ -54702,8 +56030,8 @@
         <w:t xml:space="preserve">most active at each phase gate in Part 1B.3 — W8, W14, W30, W38, W42, W43, W50, and W64 — since a Phase Gate checkpoint is this loop’s most common trigger.</w:t>
       </w:r>
     </w:p>
-    <w:bookmarkEnd w:id="86"/>
-    <w:bookmarkStart w:id="87" w:name="e2e-07-champion-early-warning-loop"/>
+    <w:bookmarkEnd w:id="87"/>
+    <w:bookmarkStart w:id="88" w:name="e2e-07-champion-early-warning-loop"/>
     <w:p>
       <w:pPr>
         <w:pStyle w:val="Heading4"/>
@@ -54844,8 +56172,8 @@
         <w:t xml:space="preserve">operational from W12 onward, once Build’s Task 2 formally briefs the champion network (Phase 3) — and the exact mechanism that could have surfaced Exception E1’s Settat concern even earlier than the Desire score did.</w:t>
       </w:r>
     </w:p>
-    <w:bookmarkEnd w:id="87"/>
-    <w:bookmarkStart w:id="88" w:name="e2e-08-governance-escalation-loop"/>
+    <w:bookmarkEnd w:id="88"/>
+    <w:bookmarkStart w:id="89" w:name="e2e-08-governance-escalation-loop"/>
     <w:p>
       <w:pPr>
         <w:pStyle w:val="Heading4"/>
@@ -54986,9 +56314,9 @@
         <w:t xml:space="preserve">no fixed window — like E2E-05, it runs continuously wherever a Sponsor escalation and a sustainment checkpoint happen to coincide, most plausibly around Exception E5 in Part 1B.6’s Month 14.</w:t>
       </w:r>
     </w:p>
-    <w:bookmarkEnd w:id="88"/>
     <w:bookmarkEnd w:id="89"/>
-    <w:bookmarkStart w:id="90" w:name="X07935886bc9ab7c2d95bb977c10a7667c12258d"/>
+    <w:bookmarkEnd w:id="90"/>
+    <w:bookmarkStart w:id="91" w:name="X07935886bc9ab7c2d95bb977c10a7667c12258d"/>
     <w:p>
       <w:pPr>
         <w:pStyle w:val="Heading3"/>
@@ -55805,9 +57133,9 @@
         <w:pStyle w:val="FirstParagraph"/>
       </w:pPr>
     </w:p>
-    <w:bookmarkEnd w:id="90"/>
     <w:bookmarkEnd w:id="91"/>
-    <w:bookmarkStart w:id="103" w:name="Xb062a9495713b8c8b037dca833442cfc66017b0"/>
+    <w:bookmarkEnd w:id="92"/>
+    <w:bookmarkStart w:id="104" w:name="Xb062a9495713b8c8b037dca833442cfc66017b0"/>
     <w:p>
       <w:pPr>
         <w:pStyle w:val="Heading2"/>
@@ -55879,7 +57207,7 @@
         <w:t xml:space="preserve">Each case below states its archetype, business driver, target population, starting readiness pattern, and — concretely, not abstractly — which of journi’s 9 live-computed alerts it is built to exercise.</w:t>
       </w:r>
     </w:p>
-    <w:bookmarkStart w:id="92" w:name="the-scenario-library-at-a-glance"/>
+    <w:bookmarkStart w:id="93" w:name="the-scenario-library-at-a-glance"/>
     <w:p>
       <w:pPr>
         <w:pStyle w:val="Heading3"/>
@@ -56740,8 +58068,8 @@
         <w:t xml:space="preserve">Read top to bottom, the table also makes a structural point visible at a glance: eight of the nine cases run on a Phase Template with a registered End-to-End lifecycle behind it (Part 3, Appendix A.5); only the last, Restructuring, runs on the generic core chains because no dedicated lifecycle exists for it — the same gap the case’s own write-up below states directly rather than papers over.</w:t>
       </w:r>
     </w:p>
-    <w:bookmarkEnd w:id="92"/>
-    <w:bookmarkStart w:id="93" w:name="X8f9567737741ab3c6a83fb539ea0246a11ba92c"/>
+    <w:bookmarkEnd w:id="93"/>
+    <w:bookmarkStart w:id="94" w:name="X8f9567737741ab3c6a83fb539ea0246a11ba92c"/>
     <w:p>
       <w:pPr>
         <w:pStyle w:val="Heading3"/>
@@ -56836,8 +58164,8 @@
         <w:t xml:space="preserve">if a Phase Gate closes as anything other than a clean Go.</w:t>
       </w:r>
     </w:p>
-    <w:bookmarkEnd w:id="93"/>
-    <w:bookmarkStart w:id="94" w:name="Xc24d01c77d44894f2465531ef76a97acdfd22e6"/>
+    <w:bookmarkEnd w:id="94"/>
+    <w:bookmarkStart w:id="95" w:name="Xc24d01c77d44894f2465531ef76a97acdfd22e6"/>
     <w:p>
       <w:pPr>
         <w:pStyle w:val="Heading3"/>
@@ -56931,8 +58259,8 @@
         <w:t xml:space="preserve">W3 intake and diagnosis opens, running alongside the ERP program’s own Discovery; W10 clean-slate design signed off; W18 build complete; W22–26 pilot on a single process step, where the third resistance entry lands and ALT-004 fires; W34 organization-wide rollout; W44 stabilization; W52 sustainment handoff.</w:t>
       </w:r>
     </w:p>
-    <w:bookmarkEnd w:id="94"/>
-    <w:bookmarkStart w:id="95" w:name="Xf809a11e051728219602f4df9a59bd412be5988"/>
+    <w:bookmarkEnd w:id="95"/>
+    <w:bookmarkStart w:id="96" w:name="Xf809a11e051728219602f4df9a59bd412be5988"/>
     <w:p>
       <w:pPr>
         <w:pStyle w:val="Heading3"/>
@@ -57000,8 +58328,8 @@
         <w:t xml:space="preserve">W20 opportunity assessment; W24 architecture design; W29 build; W32 UAT and shadow-mode running the bot alongside the manual process for two weeks; W34 production go-live; W36 exception tuning; W38 CoE handover — the shortest case in the library, closed in 18 weeks against the ERP program’s own Build/Test window.</w:t>
       </w:r>
     </w:p>
-    <w:bookmarkEnd w:id="95"/>
-    <w:bookmarkStart w:id="96" w:name="X5bff64c3c3a26e5e158972a6291c1c524f666df"/>
+    <w:bookmarkEnd w:id="96"/>
+    <w:bookmarkStart w:id="97" w:name="X5bff64c3c3a26e5e158972a6291c1c524f666df"/>
     <w:p>
       <w:pPr>
         <w:pStyle w:val="Heading3"/>
@@ -57095,8 +58423,8 @@
         <w:t xml:space="preserve">W1 intake and diagnosis (started alongside the ERP program’s own kickoff); W12 design; W26 implementation, where the coalition gap is logged and ALT-010 fires; W38 mock-up audit; W46 certifying audit; W50 surveillance prep; ongoing surveillance beyond W52 — the longest single-phase tail in the library, since certification surveillance never formally closes.</w:t>
       </w:r>
     </w:p>
-    <w:bookmarkEnd w:id="96"/>
-    <w:bookmarkStart w:id="97" w:name="X58b69ff03d5e781d9ee9b64dcd60096cf2e421f"/>
+    <w:bookmarkEnd w:id="97"/>
+    <w:bookmarkStart w:id="98" w:name="X58b69ff03d5e781d9ee9b64dcd60096cf2e421f"/>
     <w:p>
       <w:pPr>
         <w:pStyle w:val="Heading3"/>
@@ -57190,8 +58518,8 @@
         <w:t xml:space="preserve">W27 (six months into the ERP program) diagnosis opens; W30 target-values design, and ALT-003 fires before the integration Sponsor’s first logged action; W38 leadership modeling and reinforcement build begins; W46 pilot cohort (one Tangier team, one legacy Bouregreg team); W58 organization-wide rollout; reinforcement through skepticism and institutionalization continue well past the ERP program’s own W60 close, consistent with its 18-month horizon.</w:t>
       </w:r>
     </w:p>
-    <w:bookmarkEnd w:id="97"/>
-    <w:bookmarkStart w:id="98" w:name="Xd1da5f2b710a482859daf2c6bd05f400afab0a6"/>
+    <w:bookmarkEnd w:id="98"/>
+    <w:bookmarkStart w:id="99" w:name="Xd1da5f2b710a482859daf2c6bd05f400afab0a6"/>
     <w:p>
       <w:pPr>
         <w:pStyle w:val="Heading3"/>
@@ -57311,8 +58639,8 @@
         <w:t xml:space="preserve">W35 current operating model assessment opens, once the ERP program’s own Build phase has exposed the duplication; W42 target operating model design; W48 detailed org design; W52 pilot transition (Casablanca Finance first); W56 full transition, where the 30-day checkpoint lands High regression risk and ALT-002/ALT-015 fire; W64 governance adoption tracking and standing rhythm handover, resolved only once a clean checkpoint follows.</w:t>
       </w:r>
     </w:p>
-    <w:bookmarkEnd w:id="98"/>
-    <w:bookmarkStart w:id="99" w:name="Xbdad89381d253d0349901a77aa9f9d33db0c4d7"/>
+    <w:bookmarkEnd w:id="99"/>
+    <w:bookmarkStart w:id="100" w:name="Xbdad89381d253d0349901a77aa9f9d33db0c4d7"/>
     <w:p>
       <w:pPr>
         <w:pStyle w:val="Heading3"/>
@@ -57406,8 +58734,8 @@
         <w:t xml:space="preserve">W1 regulatory requirement and gap analysis, run from the very start of the tenant’s life given the fixed external deadline; W14 control design; W28 control implementation; W40 internal audit / independent testing; W48 controls go live, timed deliberately ahead of the ERP program’s own Deploy week so the two do not compete for the same Legal/Compliance attention; W52 first monitoring cycle; ongoing compliance handover beyond W60.</w:t>
       </w:r>
     </w:p>
-    <w:bookmarkEnd w:id="99"/>
-    <w:bookmarkStart w:id="100" w:name="Xd2703e5f97ca8b66b1a6308b2a70c5ae7e2b0e8"/>
+    <w:bookmarkEnd w:id="100"/>
+    <w:bookmarkStart w:id="101" w:name="Xd2703e5f97ca8b66b1a6308b2a70c5ae7e2b0e8"/>
     <w:p>
       <w:pPr>
         <w:pStyle w:val="Heading3"/>
@@ -57475,8 +58803,8 @@
         <w:t xml:space="preserve">W16 intake and diagnosis; W22 case for change and target-state design; W30 build (curriculum development, AI-assisted drafting via M16); W38 validation with a pilot cohort; W44 deployment across both plants, deliberately staggered a month behind the ERP program’s own Train phase so the two curricula don’t compete for the same plant-floor hours; W50 stabilization and hypercare; W58 sustainment and closure.</w:t>
       </w:r>
     </w:p>
-    <w:bookmarkEnd w:id="100"/>
-    <w:bookmarkStart w:id="101" w:name="Xbac664706ee9184f4e0881521cc2cb67c743150"/>
+    <w:bookmarkEnd w:id="101"/>
+    <w:bookmarkStart w:id="102" w:name="Xbac664706ee9184f4e0881521cc2cb67c743150"/>
     <w:p>
       <w:pPr>
         <w:pStyle w:val="Heading3"/>
@@ -57570,8 +58898,8 @@
         <w:t xml:space="preserve">W40 mobilization (E2E-01, run generically since no dedicated template exists); W44 capability and divergence management as the affected line’s staff are assessed for redeployment; W46 resistance crosses the threshold and ALT-004 fires for the second, independent time in the Organization; W50 adoption-to-sustainment begins as the consolidated line stabilizes; W64 ongoing, since a restructuring’s emotional tail is realistically the longest in the library relative to its short technical timeline.</w:t>
       </w:r>
     </w:p>
-    <w:bookmarkEnd w:id="101"/>
-    <w:bookmarkStart w:id="102" w:name="what-the-portfolio-view-shows"/>
+    <w:bookmarkEnd w:id="102"/>
+    <w:bookmarkStart w:id="103" w:name="what-the-portfolio-view-shows"/>
     <w:p>
       <w:pPr>
         <w:pStyle w:val="Heading3"/>
@@ -57701,9 +59029,9 @@
         <w:pStyle w:val="FirstParagraph"/>
       </w:pPr>
     </w:p>
-    <w:bookmarkEnd w:id="102"/>
     <w:bookmarkEnd w:id="103"/>
-    <w:bookmarkStart w:id="110" w:name="part-5-alerts-and-analytics-reference"/>
+    <w:bookmarkEnd w:id="104"/>
+    <w:bookmarkStart w:id="111" w:name="part-5-alerts-and-analytics-reference"/>
     <w:p>
       <w:pPr>
         <w:pStyle w:val="Heading2"/>
@@ -57717,7 +59045,7 @@
         <w:t xml:space="preserve">Part 5 — Alerts and Analytics Reference</w:t>
       </w:r>
     </w:p>
-    <w:bookmarkStart w:id="104" w:name="how-alerts-work-in-journi"/>
+    <w:bookmarkStart w:id="105" w:name="how-alerts-work-in-journi"/>
     <w:p>
       <w:pPr>
         <w:pStyle w:val="Heading3"/>
@@ -57768,8 +59096,8 @@
         <w:t xml:space="preserve">— they actually fire, dismiss, and re-evaluate as Bouregreg Group’s data changes. The other 7 are documented for traceability but never fire in this build, for two different reasons stated plainly rather than left implicit: 6 depend on infrastructure journi does not have (a real backend, AI confidence scoring, authentication lockout, a request-tracking system), and the 7th — Champion Coverage Below Target — is excluded because journi has no structured champion-tracking data model to compute it from (a coalition member carries a free-text role field, not a governed Champion entity), so there is no genuine signal to compute, only one that could be faked.</w:t>
       </w:r>
     </w:p>
-    <w:bookmarkEnd w:id="104"/>
-    <w:bookmarkStart w:id="105" w:name="the-9-live-alerts"/>
+    <w:bookmarkEnd w:id="105"/>
+    <w:bookmarkStart w:id="106" w:name="the-9-live-alerts"/>
     <w:p>
       <w:pPr>
         <w:pStyle w:val="Heading3"/>
@@ -59010,8 +60338,8 @@
         <w:t xml:space="preserve">Part 4’s nine-project scenario library was deliberately designed so that every one of these 9 fires at least once against Bouregreg Group’s real data — seven from a single project’s own record, and ALT-008 and ALT-011 only because several projects are genuinely running concurrently against overlapping populations.</w:t>
       </w:r>
     </w:p>
-    <w:bookmarkEnd w:id="105"/>
-    <w:bookmarkStart w:id="106" w:name="the-7-catalogued-but-non-live-alerts"/>
+    <w:bookmarkEnd w:id="106"/>
+    <w:bookmarkStart w:id="107" w:name="the-7-catalogued-but-non-live-alerts"/>
     <w:p>
       <w:pPr>
         <w:pStyle w:val="Heading3"/>
@@ -59497,8 +60825,8 @@
         </w:tc>
       </w:tr>
     </w:tbl>
-    <w:bookmarkEnd w:id="106"/>
-    <w:bookmarkStart w:id="107" w:name="Xf6565557127911adf304fe9ac3cbe63c836db27"/>
+    <w:bookmarkEnd w:id="107"/>
+    <w:bookmarkStart w:id="108" w:name="Xf6565557127911adf304fe9ac3cbe63c836db27"/>
     <w:p>
       <w:pPr>
         <w:pStyle w:val="Heading3"/>
@@ -59630,8 +60958,8 @@
         <w:t xml:space="preserve">It is not a separate module; it is computed live from M5 and M6 data and surfaces exclusively as ALT-001 in the Notification Center.</w:t>
       </w:r>
     </w:p>
-    <w:bookmarkEnd w:id="107"/>
-    <w:bookmarkStart w:id="108" w:name="where-to-look-by-role"/>
+    <w:bookmarkEnd w:id="108"/>
+    <w:bookmarkStart w:id="109" w:name="where-to-look-by-role"/>
     <w:p>
       <w:pPr>
         <w:pStyle w:val="Heading3"/>
@@ -59743,8 +61071,8 @@
         <w:t xml:space="preserve">: none of the 9 live alerts route to Super Admin by default; their standing responsibility is Part 1’s tenant configuration (License, Permission Matrix, Governance Settings), not day-to-day alert triage.</w:t>
       </w:r>
     </w:p>
-    <w:bookmarkEnd w:id="108"/>
-    <w:bookmarkStart w:id="109" w:name="alert-to-scenario-cross-reference"/>
+    <w:bookmarkEnd w:id="109"/>
+    <w:bookmarkStart w:id="110" w:name="alert-to-scenario-cross-reference"/>
     <w:p>
       <w:pPr>
         <w:pStyle w:val="Heading3"/>
@@ -60380,9 +61708,9 @@
         <w:pStyle w:val="FirstParagraph"/>
       </w:pPr>
     </w:p>
-    <w:bookmarkEnd w:id="109"/>
     <w:bookmarkEnd w:id="110"/>
-    <w:bookmarkStart w:id="121" w:name="appendix-quick-reference"/>
+    <w:bookmarkEnd w:id="111"/>
+    <w:bookmarkStart w:id="122" w:name="appendix-quick-reference"/>
     <w:p>
       <w:pPr>
         <w:pStyle w:val="Heading2"/>
@@ -60396,7 +61724,7 @@
         <w:t xml:space="preserve">Appendix — Quick Reference</w:t>
       </w:r>
     </w:p>
-    <w:bookmarkStart w:id="111" w:name="a.1-role-legend"/>
+    <w:bookmarkStart w:id="112" w:name="a.1-role-legend"/>
     <w:p>
       <w:pPr>
         <w:pStyle w:val="Heading3"/>
@@ -61246,8 +62574,8 @@
         </w:tc>
       </w:tr>
     </w:tbl>
-    <w:bookmarkEnd w:id="111"/>
-    <w:bookmarkStart w:id="112" w:name="a.2-racsi-legend"/>
+    <w:bookmarkEnd w:id="112"/>
+    <w:bookmarkStart w:id="113" w:name="a.2-racsi-legend"/>
     <w:p>
       <w:pPr>
         <w:pStyle w:val="Heading3"/>
@@ -61801,8 +63129,8 @@
         <w:t xml:space="preserve">End User.</w:t>
       </w:r>
     </w:p>
-    <w:bookmarkEnd w:id="112"/>
-    <w:bookmarkStart w:id="113" w:name="a.3-the-four-frameworks-one-page"/>
+    <w:bookmarkEnd w:id="113"/>
+    <w:bookmarkStart w:id="114" w:name="a.3-the-four-frameworks-one-page"/>
     <w:p>
       <w:pPr>
         <w:pStyle w:val="Heading3"/>
@@ -62468,8 +63796,8 @@
         </w:tc>
       </w:tr>
     </w:tbl>
-    <w:bookmarkEnd w:id="113"/>
-    <w:bookmarkStart w:id="114" w:name="a.4-module-index-m1m20"/>
+    <w:bookmarkEnd w:id="114"/>
+    <w:bookmarkStart w:id="115" w:name="a.4-module-index-m1m21"/>
     <w:p>
       <w:pPr>
         <w:pStyle w:val="Heading3"/>
@@ -62480,7 +63808,7 @@
           <w:color w:val="3F827B"/>
           <w:sz w:val="29"/>
         </w:rPr>
-        <w:t xml:space="preserve">A.4 Module Index (M1–M20)</w:t>
+        <w:t xml:space="preserve">A.4 Module Index (M1–M21)</w:t>
       </w:r>
     </w:p>
     <w:tbl>
@@ -63878,9 +65206,74 @@
           </w:p>
         </w:tc>
       </w:tr>
+      <w:tr>
+        <w:trPr>
+          <w:cantSplit/>
+        </w:trPr>
+        <w:tc>
+          <w:tcPr/>
+          <w:p>
+            <w:pPr>
+              <w:pStyle w:val="Compact"/>
+              <w:jc w:val="left"/>
+            </w:pPr>
+            <w:r>
+              <w:rPr>
+                <w:sz w:val="22"/>
+              </w:rPr>
+              <w:t xml:space="preserve">M21</w:t>
+            </w:r>
+          </w:p>
+        </w:tc>
+        <w:tc>
+          <w:tcPr/>
+          <w:p>
+            <w:pPr>
+              <w:pStyle w:val="Compact"/>
+              <w:jc w:val="left"/>
+            </w:pPr>
+            <w:r>
+              <w:rPr>
+                <w:sz w:val="22"/>
+              </w:rPr>
+              <w:t xml:space="preserve">Field Notes</w:t>
+            </w:r>
+          </w:p>
+        </w:tc>
+        <w:tc>
+          <w:tcPr/>
+          <w:p>
+            <w:pPr>
+              <w:pStyle w:val="Compact"/>
+              <w:jc w:val="left"/>
+            </w:pPr>
+            <w:r>
+              <w:rPr>
+                <w:sz w:val="22"/>
+              </w:rPr>
+              <w:t xml:space="preserve">Freeform log: category, related module, author, body</w:t>
+            </w:r>
+          </w:p>
+        </w:tc>
+        <w:tc>
+          <w:tcPr/>
+          <w:p>
+            <w:pPr>
+              <w:pStyle w:val="Compact"/>
+              <w:jc w:val="left"/>
+            </w:pPr>
+            <w:r>
+              <w:rPr>
+                <w:sz w:val="22"/>
+              </w:rPr>
+              <w:t xml:space="preserve">CRUD</w:t>
+            </w:r>
+          </w:p>
+        </w:tc>
+      </w:tr>
     </w:tbl>
-    <w:bookmarkEnd w:id="114"/>
-    <w:bookmarkStart w:id="115" w:name="a.5-the-16-end-to-end-processes-index"/>
+    <w:bookmarkEnd w:id="115"/>
+    <w:bookmarkStart w:id="116" w:name="a.5-the-16-end-to-end-processes-index"/>
     <w:p>
       <w:pPr>
         <w:pStyle w:val="Heading3"/>
@@ -65030,8 +66423,8 @@
         </w:tc>
       </w:tr>
     </w:tbl>
-    <w:bookmarkEnd w:id="115"/>
-    <w:bookmarkStart w:id="116" w:name="a.6-glossary"/>
+    <w:bookmarkEnd w:id="116"/>
+    <w:bookmarkStart w:id="117" w:name="a.6-glossary"/>
     <w:p>
       <w:pPr>
         <w:pStyle w:val="Heading3"/>
@@ -65428,8 +66821,8 @@
         <w:pStyle w:val="FirstParagraph"/>
       </w:pPr>
     </w:p>
-    <w:bookmarkEnd w:id="116"/>
-    <w:bookmarkStart w:id="117" w:name="a.7-a-worked-racsi-grid-example-m18"/>
+    <w:bookmarkEnd w:id="117"/>
+    <w:bookmarkStart w:id="118" w:name="a.7-a-worked-racsi-grid-example-m18"/>
     <w:p>
       <w:pPr>
         <w:pStyle w:val="Heading3"/>
@@ -66081,8 +67474,8 @@
         <w:pStyle w:val="BodyText"/>
       </w:pPr>
     </w:p>
-    <w:bookmarkEnd w:id="117"/>
-    <w:bookmarkStart w:id="118" w:name="a.8-sample-journi-entries"/>
+    <w:bookmarkEnd w:id="118"/>
+    <w:bookmarkStart w:id="119" w:name="a.8-sample-journi-entries"/>
     <w:p>
       <w:pPr>
         <w:pStyle w:val="Heading3"/>
@@ -66363,8 +67756,8 @@
         <w:pStyle w:val="BodyText"/>
       </w:pPr>
     </w:p>
-    <w:bookmarkEnd w:id="118"/>
-    <w:bookmarkStart w:id="119" w:name="a.9-frequently-asked-questions"/>
+    <w:bookmarkEnd w:id="119"/>
+    <w:bookmarkStart w:id="120" w:name="a.9-frequently-asked-questions"/>
     <w:p>
       <w:pPr>
         <w:pStyle w:val="Heading3"/>
@@ -66767,8 +68160,8 @@
         <w:t xml:space="preserve">In a real deployment it plausibly would, and that concentration is itself worth naming: journi’s Sponsor &amp; Coalition module (M7) tracks each project’s sponsorship independently, so an overloaded Sponsor shows up as thinning visibility across multiple projects rather than being hidden by one project’s own clean-looking record — exactly the kind of portfolio-level signal ALT-003 (Sponsor Coverage Gap) is built to catch if that CFO’s attention genuinely starts to spread too thin.</w:t>
       </w:r>
     </w:p>
-    <w:bookmarkEnd w:id="119"/>
-    <w:bookmarkStart w:id="120" w:name="about-this-version"/>
+    <w:bookmarkEnd w:id="120"/>
+    <w:bookmarkStart w:id="121" w:name="about-this-version"/>
     <w:p>
       <w:pPr>
         <w:pStyle w:val="Heading3"/>
@@ -66826,7 +68219,7 @@
         <w:rPr>
           <w:sz w:val="25"/>
         </w:rPr>
-        <w:t xml:space="preserve">a complete tenant build from a blank deployment (Part 1); a 64-week ERP program run week by week through all four frameworks’ real stage vocabulary, normal flow and all six documented exceptions, in full task-and-step detail (Part 1B); every one of journi’s 20 modules with its real CRUD and RBAC behavior (Part 2); all 16 registered End-to-End processes, each traced to a real point in the Bouregreg scenario (Part 3); a nine-project scenario library covering eight of journi’s ten Main Project archetypes and exercising all 9 live-computed alerts at least once (Part 4); the full alert catalog and the two automated readiness metrics behind it (Part 5); and a nine-section quick-reference appendix, from role and RACSI legends through a worked grid example, sample field entries, and this FAQ.</w:t>
+        <w:t xml:space="preserve">a complete tenant build from a blank deployment (Part 1); a 64-week ERP program run week by week through all four frameworks’ real stage vocabulary, normal flow and all six documented exceptions, in full task-and-step detail (Part 1B); every one of journi’s 21 modules with its real CRUD and RBAC behavior (Part 2); all 16 registered End-to-End processes, each traced to a real point in the Bouregreg scenario (Part 3); a nine-project scenario library covering eight of journi’s ten Main Project archetypes and exercising all 9 live-computed alerts at least once (Part 4); the full alert catalog and the two automated readiness metrics behind it (Part 5); and a nine-section quick-reference appendix, from role and RACSI legends through a worked grid example, sample field entries, and this FAQ.</w:t>
       </w:r>
     </w:p>
     <w:p>
@@ -66902,8 +68295,8 @@
         <w:t xml:space="preserve">This concludes the journi Complete User Guide — Parts 1, 1B, and 2 through 5, plus this Appendix.</w:t>
       </w:r>
     </w:p>
-    <w:bookmarkEnd w:id="120"/>
     <w:bookmarkEnd w:id="121"/>
+    <w:bookmarkEnd w:id="122"/>
     <w:sectPr>
       <w:headerReference w:type="default" r:id="rId9"/>
       <w:footerReference w:type="default" r:id="rId10"/>

</xml_diff>